<commit_message>
new promt + uml
</commit_message>
<xml_diff>
--- a/docs/template.docx
+++ b/docs/template.docx
@@ -12,6 +12,8 @@
         <w:jc w:val="center"/>
         <w:rPr>
           <w:rStyle w:val="32"/>
+          <w:b/>
+          <w:bCs/>
           <w:sz w:val="44"/>
           <w:szCs w:val="28"/>
         </w:rPr>
@@ -19,6 +21,8 @@
       <w:r>
         <w:rPr>
           <w:rStyle w:val="32"/>
+          <w:b/>
+          <w:bCs/>
           <w:sz w:val="44"/>
           <w:szCs w:val="28"/>
         </w:rPr>
@@ -190,121 +194,31 @@
       </w:r>
     </w:p>
     <w:p>
+      <w:r>
+        <w:t>{{</w:t>
+      </w:r>
+      <w:proofErr w:type="spellStart"/>
+      <w:r>
+        <w:t>project_mission_text</w:t>
+      </w:r>
+      <w:proofErr w:type="spellEnd"/>
+      <w:r>
+        <w:t>}}</w:t>
+      </w:r>
+      <w:r>
+        <w:t xml:space="preserve"> </w:t>
+      </w:r>
+    </w:p>
+    <w:p>
       <w:pPr>
         <w:rPr>
           <w:rFonts w:ascii="Arial" w:hAnsi="Arial" w:cs="Arial"/>
         </w:rPr>
       </w:pPr>
       <w:r>
-        <w:t>{{</w:t>
-      </w:r>
-      <w:proofErr w:type="spellStart"/>
-      <w:r>
-        <w:t>project_mission_text</w:t>
-      </w:r>
-      <w:proofErr w:type="spellEnd"/>
-      <w:r>
-        <w:t>}}</w:t>
-      </w:r>
-      <w:r>
-        <w:t xml:space="preserve"> </w:t>
-      </w:r>
-      <w:r>
         <w:rPr>
           <w:rFonts w:ascii="Arial" w:hAnsi="Arial" w:cs="Arial"/>
         </w:rPr>
-        <w:br w:type="page"/>
-      </w:r>
-    </w:p>
-    <w:p>
-      <w:pPr>
-        <w:pStyle w:val="1"/>
-      </w:pPr>
-      <w:r>
-        <w:lastRenderedPageBreak/>
-        <w:t>3. Assumptions &amp; Risks</w:t>
-      </w:r>
-    </w:p>
-    <w:p>
-      <w:pPr>
-        <w:pStyle w:val="21"/>
-        <w:rPr>
-          <w:rFonts w:ascii="Times New Roman" w:hAnsi="Times New Roman"/>
-          <w:sz w:val="27"/>
-        </w:rPr>
-      </w:pPr>
-      <w:r>
-        <w:t>3.1 Assumptions</w:t>
-      </w:r>
-    </w:p>
-    <w:p>
-      <w:r>
-        <w:rPr>
-          <w:rStyle w:val="HTML"/>
-          <w:rFonts w:eastAsia="Roboto Light"/>
-        </w:rPr>
-        <w:t>{{</w:t>
-      </w:r>
-      <w:proofErr w:type="spellStart"/>
-      <w:r>
-        <w:rPr>
-          <w:rStyle w:val="HTML"/>
-          <w:rFonts w:eastAsia="Roboto Light"/>
-        </w:rPr>
-        <w:t>assumptions_text</w:t>
-      </w:r>
-      <w:proofErr w:type="spellEnd"/>
-      <w:r>
-        <w:rPr>
-          <w:rStyle w:val="HTML"/>
-          <w:rFonts w:eastAsia="Roboto Light"/>
-        </w:rPr>
-        <w:t>}}</w:t>
-      </w:r>
-    </w:p>
-    <w:p>
-      <w:pPr>
-        <w:pStyle w:val="21"/>
-      </w:pPr>
-      <w:r>
-        <w:t>3.2 Risks and Mitigation</w:t>
-      </w:r>
-    </w:p>
-    <w:p>
-      <w:pPr>
-        <w:rPr>
-          <w:rStyle w:val="HTML"/>
-          <w:rFonts w:eastAsia="Roboto Light"/>
-        </w:rPr>
-      </w:pPr>
-      <w:r>
-        <w:rPr>
-          <w:rStyle w:val="HTML"/>
-          <w:rFonts w:eastAsia="Roboto Light"/>
-        </w:rPr>
-        <w:t>{{</w:t>
-      </w:r>
-      <w:proofErr w:type="spellStart"/>
-      <w:r>
-        <w:rPr>
-          <w:rStyle w:val="HTML"/>
-          <w:rFonts w:eastAsia="Roboto Light"/>
-        </w:rPr>
-        <w:t>risks_text</w:t>
-      </w:r>
-      <w:proofErr w:type="spellEnd"/>
-      <w:r>
-        <w:rPr>
-          <w:rStyle w:val="HTML"/>
-          <w:rFonts w:eastAsia="Roboto Light"/>
-        </w:rPr>
-        <w:t>}}</w:t>
-      </w:r>
-      <w:bookmarkStart w:id="0" w:name="_5vqw3839u8xy" w:colFirst="0" w:colLast="0"/>
-      <w:bookmarkEnd w:id="0"/>
-    </w:p>
-    <w:p>
-      <w:r>
         <w:br w:type="page"/>
       </w:r>
     </w:p>
@@ -332,7 +246,19 @@
           <w:lang w:val="en-US"/>
         </w:rPr>
         <w:lastRenderedPageBreak/>
-        <w:t>4. Technical Implementation Proposal</w:t>
+        <w:t>3</w:t>
+      </w:r>
+      <w:r>
+        <w:rPr>
+          <w:rFonts w:ascii="Roboto" w:eastAsia="Roboto" w:hAnsi="Roboto" w:cs="Roboto"/>
+          <w:b w:val="0"/>
+          <w:bCs w:val="0"/>
+          <w:color w:val="0019A9"/>
+          <w:sz w:val="44"/>
+          <w:szCs w:val="44"/>
+          <w:lang w:val="en-US"/>
+        </w:rPr>
+        <w:t>. Technical Implementation Proposal</w:t>
       </w:r>
     </w:p>
     <w:p>
@@ -346,7 +272,13 @@
         </w:rPr>
       </w:pPr>
       <w:r>
-        <w:t>4.1 Backend</w:t>
+        <w:rPr>
+          <w:lang w:val="en-US"/>
+        </w:rPr>
+        <w:t>3</w:t>
+      </w:r>
+      <w:r>
+        <w:t>.1 Backend</w:t>
       </w:r>
     </w:p>
     <w:p>
@@ -379,23 +311,26 @@
         <w:pStyle w:val="21"/>
       </w:pPr>
       <w:r>
-        <w:t>4.2 Frontend (Web UI)</w:t>
+        <w:rPr>
+          <w:lang w:val="en-US"/>
+        </w:rPr>
+        <w:t>3</w:t>
+      </w:r>
+      <w:r>
+        <w:t>.</w:t>
+      </w:r>
+      <w:r>
+        <w:t>2</w:t>
+      </w:r>
+      <w:r>
+        <w:t xml:space="preserve"> Deployment</w:t>
       </w:r>
     </w:p>
     <w:p>
-      <w:pPr>
-        <w:rPr>
-          <w:rFonts w:ascii="Roboto" w:hAnsi="Roboto"/>
-          <w:sz w:val="28"/>
-          <w:szCs w:val="28"/>
-        </w:rPr>
-      </w:pPr>
       <w:r>
         <w:rPr>
           <w:rStyle w:val="HTML"/>
-          <w:rFonts w:ascii="Roboto" w:eastAsia="Roboto Light" w:hAnsi="Roboto"/>
-          <w:sz w:val="22"/>
-          <w:szCs w:val="22"/>
+          <w:rFonts w:eastAsia="Roboto Light"/>
         </w:rPr>
         <w:t>{{</w:t>
       </w:r>
@@ -403,19 +338,15 @@
       <w:r>
         <w:rPr>
           <w:rStyle w:val="HTML"/>
-          <w:rFonts w:ascii="Roboto" w:eastAsia="Roboto Light" w:hAnsi="Roboto"/>
-          <w:sz w:val="22"/>
-          <w:szCs w:val="22"/>
+          <w:rFonts w:eastAsia="Roboto Light"/>
         </w:rPr>
-        <w:t>technical_frontend_text</w:t>
+        <w:t>technical_deployment_text</w:t>
       </w:r>
       <w:proofErr w:type="spellEnd"/>
       <w:r>
         <w:rPr>
           <w:rStyle w:val="HTML"/>
-          <w:rFonts w:ascii="Roboto" w:eastAsia="Roboto Light" w:hAnsi="Roboto"/>
-          <w:sz w:val="22"/>
-          <w:szCs w:val="22"/>
+          <w:rFonts w:eastAsia="Roboto Light"/>
         </w:rPr>
         <w:t>}}</w:t>
       </w:r>
@@ -425,40 +356,19 @@
         <w:pStyle w:val="21"/>
       </w:pPr>
       <w:r>
-        <w:t>4.3 Deployment</w:t>
-      </w:r>
-    </w:p>
-    <w:p>
-      <w:r>
         <w:rPr>
-          <w:rStyle w:val="HTML"/>
-          <w:rFonts w:eastAsia="Roboto Light"/>
+          <w:lang w:val="en-US"/>
         </w:rPr>
-        <w:t>{{</w:t>
-      </w:r>
-      <w:proofErr w:type="spellStart"/>
-      <w:r>
-        <w:rPr>
-          <w:rStyle w:val="HTML"/>
-          <w:rFonts w:eastAsia="Roboto Light"/>
-        </w:rPr>
-        <w:t>technical_deployment_text</w:t>
-      </w:r>
-      <w:proofErr w:type="spellEnd"/>
-      <w:r>
-        <w:rPr>
-          <w:rStyle w:val="HTML"/>
-          <w:rFonts w:eastAsia="Roboto Light"/>
-        </w:rPr>
-        <w:t>}}</w:t>
-      </w:r>
-    </w:p>
-    <w:p>
-      <w:pPr>
-        <w:pStyle w:val="21"/>
-      </w:pPr>
-      <w:r>
-        <w:t>4.4 Engagement Model</w:t>
+        <w:t>3</w:t>
+      </w:r>
+      <w:r>
+        <w:t>.</w:t>
+      </w:r>
+      <w:r>
+        <w:t>3</w:t>
+      </w:r>
+      <w:r>
+        <w:t xml:space="preserve"> Engagement Model</w:t>
       </w:r>
     </w:p>
     <w:p>
@@ -508,8 +418,14 @@
         </w:rPr>
       </w:pPr>
       <w:r>
+        <w:rPr>
+          <w:lang w:val="en-US"/>
+        </w:rPr>
         <w:lastRenderedPageBreak/>
-        <w:t xml:space="preserve">5. Project Execution </w:t>
+        <w:t>4</w:t>
+      </w:r>
+      <w:r>
+        <w:t xml:space="preserve">. Project Execution </w:t>
       </w:r>
     </w:p>
     <w:p>
@@ -517,7 +433,13 @@
         <w:pStyle w:val="21"/>
       </w:pPr>
       <w:r>
-        <w:t>5.1 Delivery Approach</w:t>
+        <w:rPr>
+          <w:lang w:val="en-US"/>
+        </w:rPr>
+        <w:t>4</w:t>
+      </w:r>
+      <w:r>
+        <w:t>.1 Delivery Approach</w:t>
       </w:r>
     </w:p>
     <w:p>
@@ -556,7 +478,13 @@
         <w:pStyle w:val="21"/>
       </w:pPr>
       <w:r>
-        <w:t>5.2 Team Structure</w:t>
+        <w:rPr>
+          <w:lang w:val="en-US"/>
+        </w:rPr>
+        <w:t>4</w:t>
+      </w:r>
+      <w:r>
+        <w:t>.2 Team Structure</w:t>
       </w:r>
     </w:p>
     <w:p>
@@ -601,7 +529,13 @@
         <w:pStyle w:val="21"/>
       </w:pPr>
       <w:r>
-        <w:t>5.3 Status Reporting &amp; Client Interactions</w:t>
+        <w:rPr>
+          <w:lang w:val="en-US"/>
+        </w:rPr>
+        <w:t>4</w:t>
+      </w:r>
+      <w:r>
+        <w:t>.3 Status Reporting &amp; Client Interactions</w:t>
       </w:r>
     </w:p>
     <w:p>
@@ -657,7 +591,7 @@
           <w:lang w:val="ru-RU"/>
         </w:rPr>
         <w:lastRenderedPageBreak/>
-        <w:t>6</w:t>
+        <w:t>5</w:t>
       </w:r>
       <w:r>
         <w:t>. Key Deliverables</w:t>
@@ -764,9 +698,16 @@
       <w:r>
         <w:rPr>
           <w:rStyle w:val="10"/>
+          <w:lang w:val="ru-RU"/>
         </w:rPr>
         <w:lastRenderedPageBreak/>
-        <w:t>7. Quality Assurance</w:t>
+        <w:t>6</w:t>
+      </w:r>
+      <w:r>
+        <w:rPr>
+          <w:rStyle w:val="10"/>
+        </w:rPr>
+        <w:t>. Quality Assurance</w:t>
       </w:r>
       <w:r>
         <w:t xml:space="preserve"> </w:t>
@@ -777,7 +718,13 @@
         <w:pStyle w:val="21"/>
       </w:pPr>
       <w:r>
-        <w:t>7.1 Test Strategy &amp; Planning</w:t>
+        <w:rPr>
+          <w:lang w:val="ru-RU"/>
+        </w:rPr>
+        <w:t>5</w:t>
+      </w:r>
+      <w:r>
+        <w:t>.1 Test Strategy &amp; Planning</w:t>
       </w:r>
     </w:p>
     <w:p>
@@ -822,7 +769,13 @@
         <w:pStyle w:val="21"/>
       </w:pPr>
       <w:r>
-        <w:t>7.2 Types of Testing</w:t>
+        <w:rPr>
+          <w:lang w:val="ru-RU"/>
+        </w:rPr>
+        <w:t>5</w:t>
+      </w:r>
+      <w:r>
+        <w:t>.2 Types of Testing</w:t>
       </w:r>
     </w:p>
     <w:p>
@@ -880,8 +833,14 @@
         <w:pStyle w:val="1"/>
       </w:pPr>
       <w:r>
+        <w:rPr>
+          <w:lang w:val="ru-RU"/>
+        </w:rPr>
         <w:lastRenderedPageBreak/>
-        <w:t>8. Development Lifecycle Diagram</w:t>
+        <w:t>6</w:t>
+      </w:r>
+      <w:r>
+        <w:t>. Development Lifecycle Diagram</w:t>
       </w:r>
     </w:p>
     <w:p>
@@ -896,6 +855,12 @@
       <w:r>
         <w:t>}}</w:t>
       </w:r>
+    </w:p>
+    <w:p>
+      <w:pPr>
+        <w:spacing w:after="200" w:line="276" w:lineRule="auto"/>
+        <w:jc w:val="left"/>
+      </w:pPr>
       <w:r>
         <w:br w:type="page"/>
       </w:r>
@@ -905,8 +870,53 @@
         <w:pStyle w:val="1"/>
       </w:pPr>
       <w:r>
+        <w:rPr>
+          <w:lang w:val="ru-RU"/>
+        </w:rPr>
         <w:lastRenderedPageBreak/>
-        <w:t>9. Timeline &amp; Schedule</w:t>
+        <w:t>6</w:t>
+      </w:r>
+      <w:r>
+        <w:t xml:space="preserve">. </w:t>
+      </w:r>
+      <w:r>
+        <w:t>UML</w:t>
+      </w:r>
+      <w:r>
+        <w:t xml:space="preserve"> Diagram</w:t>
+      </w:r>
+    </w:p>
+    <w:p>
+      <w:r>
+        <w:t>{{</w:t>
+      </w:r>
+      <w:proofErr w:type="spellStart"/>
+      <w:r>
+        <w:t>uml_diagram</w:t>
+      </w:r>
+      <w:proofErr w:type="spellEnd"/>
+      <w:r>
+        <w:t>}}</w:t>
+      </w:r>
+    </w:p>
+    <w:p>
+      <w:r>
+        <w:br w:type="page"/>
+      </w:r>
+    </w:p>
+    <w:p>
+      <w:pPr>
+        <w:pStyle w:val="1"/>
+      </w:pPr>
+      <w:r>
+        <w:rPr>
+          <w:lang w:val="ru-RU"/>
+        </w:rPr>
+        <w:lastRenderedPageBreak/>
+        <w:t>8</w:t>
+      </w:r>
+      <w:r>
+        <w:t>. Timeline &amp; Schedule</w:t>
       </w:r>
     </w:p>
     <w:tbl>
@@ -971,6 +981,116 @@
       <w:r>
         <w:t>}}</w:t>
       </w:r>
+    </w:p>
+    <w:p>
+      <w:pPr>
+        <w:pStyle w:val="1"/>
+      </w:pPr>
+      <w:r>
+        <w:br w:type="page"/>
+      </w:r>
+      <w:r>
+        <w:rPr>
+          <w:lang w:val="ru-RU"/>
+        </w:rPr>
+        <w:lastRenderedPageBreak/>
+        <w:t>9</w:t>
+      </w:r>
+      <w:r>
+        <w:t>. Assumptions &amp; Risks</w:t>
+      </w:r>
+    </w:p>
+    <w:p>
+      <w:pPr>
+        <w:pStyle w:val="21"/>
+        <w:rPr>
+          <w:rFonts w:ascii="Times New Roman" w:hAnsi="Times New Roman"/>
+          <w:sz w:val="27"/>
+        </w:rPr>
+      </w:pPr>
+      <w:r>
+        <w:rPr>
+          <w:lang w:val="ru-RU"/>
+        </w:rPr>
+        <w:t>9</w:t>
+      </w:r>
+      <w:r>
+        <w:t>.1 Assumptions</w:t>
+      </w:r>
+    </w:p>
+    <w:p>
+      <w:r>
+        <w:rPr>
+          <w:rStyle w:val="HTML"/>
+          <w:rFonts w:eastAsia="Roboto Light"/>
+        </w:rPr>
+        <w:t>{{</w:t>
+      </w:r>
+      <w:proofErr w:type="spellStart"/>
+      <w:r>
+        <w:rPr>
+          <w:rStyle w:val="HTML"/>
+          <w:rFonts w:eastAsia="Roboto Light"/>
+        </w:rPr>
+        <w:t>assumptions_text</w:t>
+      </w:r>
+      <w:proofErr w:type="spellEnd"/>
+      <w:r>
+        <w:rPr>
+          <w:rStyle w:val="HTML"/>
+          <w:rFonts w:eastAsia="Roboto Light"/>
+        </w:rPr>
+        <w:t>}}</w:t>
+      </w:r>
+    </w:p>
+    <w:p>
+      <w:pPr>
+        <w:pStyle w:val="21"/>
+      </w:pPr>
+      <w:r>
+        <w:rPr>
+          <w:lang w:val="ru-RU"/>
+        </w:rPr>
+        <w:t>9</w:t>
+      </w:r>
+      <w:r>
+        <w:t>.2 Risks and Mitigation</w:t>
+      </w:r>
+    </w:p>
+    <w:p>
+      <w:pPr>
+        <w:rPr>
+          <w:rStyle w:val="HTML"/>
+          <w:rFonts w:eastAsia="Roboto Light"/>
+        </w:rPr>
+      </w:pPr>
+      <w:r>
+        <w:rPr>
+          <w:rStyle w:val="HTML"/>
+          <w:rFonts w:eastAsia="Roboto Light"/>
+        </w:rPr>
+        <w:t>{{</w:t>
+      </w:r>
+      <w:proofErr w:type="spellStart"/>
+      <w:r>
+        <w:rPr>
+          <w:rStyle w:val="HTML"/>
+          <w:rFonts w:eastAsia="Roboto Light"/>
+        </w:rPr>
+        <w:t>risks_text</w:t>
+      </w:r>
+      <w:proofErr w:type="spellEnd"/>
+      <w:r>
+        <w:rPr>
+          <w:rStyle w:val="HTML"/>
+          <w:rFonts w:eastAsia="Roboto Light"/>
+        </w:rPr>
+        <w:t>}}</w:t>
+      </w:r>
+      <w:bookmarkStart w:id="0" w:name="_5vqw3839u8xy" w:colFirst="0" w:colLast="0"/>
+      <w:bookmarkEnd w:id="0"/>
+    </w:p>
+    <w:p>
       <w:r>
         <w:br w:type="page"/>
       </w:r>
@@ -1336,6 +1456,8 @@
       <w:r>
         <w:t>}}</w:t>
       </w:r>
+    </w:p>
+    <w:p>
       <w:r>
         <w:br w:type="page"/>
       </w:r>

</xml_diff>